<commit_message>
Docx writer: use `_` to start all bookmark names.
This ensures that they are "hidden" and will not be read by
screen readers.

Closes #11845.
</commit_message>
<xml_diff>
--- a/test/docx/golden/custom_style_preserve.docx
+++ b/test/docx/golden/custom_style_preserve.docx
@@ -73,7 +73,7 @@
         <w:t xml:space="preserve">.</w:t>
       </w:r>
     </w:p>
-    <w:bookmarkStart w:id="12" w:name="Xe3430df616ac7cbc41472c3d8c677b6308aa642"/>
+    <w:bookmarkStart w:id="12" w:name="_e3430df616ac7cbc41472c3d8c677b6308aa642"/>
     <w:p>
       <w:pPr>
         <w:pStyle w:val="Heading2"/>
@@ -124,7 +124,7 @@
         <w:t xml:space="preserve">This should have MyInnerStyle.</w:t>
       </w:r>
     </w:p>
-    <w:bookmarkStart w:id="13" w:name="this-heading-should-not"/>
+    <w:bookmarkStart w:id="13" w:name="_356ff514133ed55ff2fb082ffa91ffd4269fe4a"/>
     <w:p>
       <w:pPr>
         <w:pStyle w:val="Heading3"/>

</xml_diff>